<commit_message>
v7.3.95-4: Mein Status - Ampel-Fix (100% statt 80%), In Bearbeitung, Manual-Download
</commit_message>
<xml_diff>
--- a/downloads/PZE_Kurzanleitung_Mitarbeiter_v3.docx
+++ b/downloads/PZE_Kurzanleitung_Mitarbeiter_v3.docx
@@ -17,7 +17,7 @@
           <w:left w:w="10" w:type="dxa"/>
           <w:right w:w="10" w:type="dxa"/>
         </w:tblCellMar>
-        <w:tblLook w:val="0000" w:firstRow="0" w:lastRow="0" w:firstColumn="0" w:lastColumn="0" w:noHBand="0" w:noVBand="0"/>
+        <w:tblLook w:val="04A0" w:firstRow="1" w:lastRow="0" w:firstColumn="1" w:lastColumn="0" w:noHBand="0" w:noVBand="1"/>
       </w:tblPr>
       <w:tblGrid>
         <w:gridCol w:w="7106"/>
@@ -145,7 +145,7 @@
           <w:left w:w="10" w:type="dxa"/>
           <w:right w:w="10" w:type="dxa"/>
         </w:tblCellMar>
-        <w:tblLook w:val="0000" w:firstRow="0" w:lastRow="0" w:firstColumn="0" w:lastColumn="0" w:noHBand="0" w:noVBand="0"/>
+        <w:tblLook w:val="04A0" w:firstRow="1" w:lastRow="0" w:firstColumn="1" w:lastColumn="0" w:noHBand="0" w:noVBand="1"/>
       </w:tblPr>
       <w:tblGrid>
         <w:gridCol w:w="10106"/>
@@ -199,6 +199,7 @@
     </w:tbl>
     <w:p>
       <w:pPr>
+        <w:spacing w:before="140" w:after="50"/>
         <w:rPr>
           <w:b/>
           <w:bCs/>
@@ -240,7 +241,7 @@
           <w:left w:w="10" w:type="dxa"/>
           <w:right w:w="10" w:type="dxa"/>
         </w:tblCellMar>
-        <w:tblLook w:val="0000" w:firstRow="0" w:lastRow="0" w:firstColumn="0" w:lastColumn="0" w:noHBand="0" w:noVBand="0"/>
+        <w:tblLook w:val="04A0" w:firstRow="1" w:lastRow="0" w:firstColumn="1" w:lastColumn="0" w:noHBand="0" w:noVBand="1"/>
       </w:tblPr>
       <w:tblGrid>
         <w:gridCol w:w="400"/>
@@ -539,7 +540,7 @@
           <w:left w:w="10" w:type="dxa"/>
           <w:right w:w="10" w:type="dxa"/>
         </w:tblCellMar>
-        <w:tblLook w:val="0000" w:firstRow="0" w:lastRow="0" w:firstColumn="0" w:lastColumn="0" w:noHBand="0" w:noVBand="0"/>
+        <w:tblLook w:val="04A0" w:firstRow="1" w:lastRow="0" w:firstColumn="1" w:lastColumn="0" w:noHBand="0" w:noVBand="1"/>
       </w:tblPr>
       <w:tblGrid>
         <w:gridCol w:w="10106"/>
@@ -614,6 +615,18 @@
         </w:tc>
       </w:tr>
     </w:tbl>
+    <w:p>
+      <w:pPr>
+        <w:spacing w:before="140" w:after="50"/>
+        <w:rPr>
+          <w:b/>
+          <w:bCs/>
+          <w:color w:val="2563EB"/>
+          <w:sz w:val="22"/>
+          <w:szCs w:val="22"/>
+        </w:rPr>
+      </w:pPr>
+    </w:p>
     <w:p>
       <w:pPr>
         <w:spacing w:before="140" w:after="50"/>
@@ -656,7 +669,7 @@
           <w:left w:w="10" w:type="dxa"/>
           <w:right w:w="10" w:type="dxa"/>
         </w:tblCellMar>
-        <w:tblLook w:val="0000" w:firstRow="0" w:lastRow="0" w:firstColumn="0" w:lastColumn="0" w:noHBand="0" w:noVBand="0"/>
+        <w:tblLook w:val="04A0" w:firstRow="1" w:lastRow="0" w:firstColumn="1" w:lastColumn="0" w:noHBand="0" w:noVBand="1"/>
       </w:tblPr>
       <w:tblGrid>
         <w:gridCol w:w="400"/>
@@ -1029,7 +1042,7 @@
                 <w:sz w:val="16"/>
                 <w:szCs w:val="16"/>
               </w:rPr>
-              <w:t xml:space="preserve"> = Urlaub, K = Krank, S = Sonstige</w:t>
+              <w:t>/K/S direkt im Tagesfeld eingeben → wird automatisch unten als Fehlzeit mit 8h gezählt</w:t>
             </w:r>
           </w:p>
         </w:tc>
@@ -1127,7 +1140,7 @@
           <w:left w:w="10" w:type="dxa"/>
           <w:right w:w="10" w:type="dxa"/>
         </w:tblCellMar>
-        <w:tblLook w:val="0000" w:firstRow="0" w:lastRow="0" w:firstColumn="0" w:lastColumn="0" w:noHBand="0" w:noVBand="0"/>
+        <w:tblLook w:val="04A0" w:firstRow="1" w:lastRow="0" w:firstColumn="1" w:lastColumn="0" w:noHBand="0" w:noVBand="1"/>
       </w:tblPr>
       <w:tblGrid>
         <w:gridCol w:w="10106"/>
@@ -1168,6 +1181,29 @@
                 <w:sz w:val="16"/>
                 <w:szCs w:val="16"/>
               </w:rPr>
+              <w:t xml:space="preserve">Fehlzeiten: </w:t>
+            </w:r>
+            <w:r>
+              <w:rPr>
+                <w:color w:val="374151"/>
+                <w:sz w:val="16"/>
+                <w:szCs w:val="16"/>
+              </w:rPr>
+              <w:t>Geben Sie U (Urlaub), K (Krank) oder S (Sonstige) direkt in ein Tagesfeld einer AP-Zeile ein. Das System erkennt den Buchstaben automatisch und überträgt die Fehlzeit in die entsprechende Zeile unten mit 8 Stunden.</w:t>
+            </w:r>
+          </w:p>
+          <w:p>
+            <w:pPr>
+              <w:spacing w:after="25"/>
+            </w:pPr>
+            <w:r>
+              <w:rPr>
+                <w:b/>
+                <w:bCs/>
+                <w:color w:val="2563EB"/>
+                <w:sz w:val="16"/>
+                <w:szCs w:val="16"/>
+              </w:rPr>
               <w:t xml:space="preserve">Zwischenspeichern: </w:t>
             </w:r>
             <w:r>
@@ -1202,6 +1238,18 @@
         </w:tc>
       </w:tr>
     </w:tbl>
+    <w:p>
+      <w:pPr>
+        <w:spacing w:before="140" w:after="50"/>
+        <w:rPr>
+          <w:b/>
+          <w:bCs/>
+          <w:color w:val="D97706"/>
+          <w:sz w:val="22"/>
+          <w:szCs w:val="22"/>
+        </w:rPr>
+      </w:pPr>
+    </w:p>
     <w:p>
       <w:pPr>
         <w:spacing w:before="140" w:after="50"/>
@@ -1244,7 +1292,7 @@
           <w:left w:w="10" w:type="dxa"/>
           <w:right w:w="10" w:type="dxa"/>
         </w:tblCellMar>
-        <w:tblLook w:val="0000" w:firstRow="0" w:lastRow="0" w:firstColumn="0" w:lastColumn="0" w:noHBand="0" w:noVBand="0"/>
+        <w:tblLook w:val="04A0" w:firstRow="1" w:lastRow="0" w:firstColumn="1" w:lastColumn="0" w:noHBand="0" w:noVBand="1"/>
       </w:tblPr>
       <w:tblGrid>
         <w:gridCol w:w="400"/>
@@ -1551,6 +1599,18 @@
         </w:tc>
       </w:tr>
     </w:tbl>
+    <w:p>
+      <w:pPr>
+        <w:spacing w:before="140" w:after="50"/>
+        <w:rPr>
+          <w:b/>
+          <w:bCs/>
+          <w:color w:val="65A655"/>
+          <w:sz w:val="22"/>
+          <w:szCs w:val="22"/>
+        </w:rPr>
+      </w:pPr>
+    </w:p>
     <w:p>
       <w:pPr>
         <w:spacing w:before="140" w:after="50"/>
@@ -1606,7 +1666,7 @@
           <w:left w:w="10" w:type="dxa"/>
           <w:right w:w="10" w:type="dxa"/>
         </w:tblCellMar>
-        <w:tblLook w:val="0000" w:firstRow="0" w:lastRow="0" w:firstColumn="0" w:lastColumn="0" w:noHBand="0" w:noVBand="0"/>
+        <w:tblLook w:val="04A0" w:firstRow="1" w:lastRow="0" w:firstColumn="1" w:lastColumn="0" w:noHBand="0" w:noVBand="1"/>
       </w:tblPr>
       <w:tblGrid>
         <w:gridCol w:w="400"/>
@@ -1986,6 +2046,11 @@
         <w:spacing w:before="60"/>
       </w:pPr>
     </w:p>
+    <w:p>
+      <w:pPr>
+        <w:spacing w:before="60"/>
+      </w:pPr>
+    </w:p>
     <w:tbl>
       <w:tblPr>
         <w:tblW w:w="10106" w:type="dxa"/>
@@ -2001,7 +2066,7 @@
           <w:left w:w="10" w:type="dxa"/>
           <w:right w:w="10" w:type="dxa"/>
         </w:tblCellMar>
-        <w:tblLook w:val="0000" w:firstRow="0" w:lastRow="0" w:firstColumn="0" w:lastColumn="0" w:noHBand="0" w:noVBand="0"/>
+        <w:tblLook w:val="04A0" w:firstRow="1" w:lastRow="0" w:firstColumn="1" w:lastColumn="0" w:noHBand="0" w:noVBand="1"/>
       </w:tblPr>
       <w:tblGrid>
         <w:gridCol w:w="10106"/>
@@ -2322,7 +2387,7 @@
         <w:noProof/>
       </w:rPr>
       <w:drawing>
-        <wp:inline distT="0" distB="0" distL="0" distR="0" wp14:anchorId="33BCA3A0" wp14:editId="66DE105B">
+        <wp:inline distT="0" distB="0" distL="0" distR="0" wp14:anchorId="13C359E1" wp14:editId="485BD57F">
           <wp:extent cx="1095375" cy="285750"/>
           <wp:effectExtent l="0" t="0" r="0" b="0"/>
           <wp:docPr id="1" name="Grafik 1"/>
@@ -2367,10 +2432,10 @@
 <file path=word/numbering.xml><?xml version="1.0" encoding="utf-8"?>
 <w:numbering xmlns:wpc="http://schemas.microsoft.com/office/word/2010/wordprocessingCanvas" xmlns:cx="http://schemas.microsoft.com/office/drawing/2014/chartex" xmlns:cx1="http://schemas.microsoft.com/office/drawing/2015/9/8/chartex" xmlns:cx2="http://schemas.microsoft.com/office/drawing/2015/10/21/chartex" xmlns:cx3="http://schemas.microsoft.com/office/drawing/2016/5/9/chartex" xmlns:cx4="http://schemas.microsoft.com/office/drawing/2016/5/10/chartex" xmlns:cx5="http://schemas.microsoft.com/office/drawing/2016/5/11/chartex" xmlns:cx6="http://schemas.microsoft.com/office/drawing/2016/5/12/chartex" xmlns:cx7="http://schemas.microsoft.com/office/drawing/2016/5/13/chartex" xmlns:cx8="http://schemas.microsoft.com/office/drawing/2016/5/14/chartex" xmlns:mc="http://schemas.openxmlformats.org/markup-compatibility/2006" xmlns:aink="http://schemas.microsoft.com/office/drawing/2016/ink" xmlns:am3d="http://schemas.microsoft.com/office/drawing/2017/model3d" xmlns:o="urn:schemas-microsoft-com:office:office" xmlns:oel="http://schemas.microsoft.com/office/2019/extlst" xmlns:r="http://schemas.openxmlformats.org/officeDocument/2006/relationships" xmlns:m="http://schemas.openxmlformats.org/officeDocument/2006/math" xmlns:v="urn:schemas-microsoft-com:vml" xmlns:wp14="http://schemas.microsoft.com/office/word/2010/wordprocessingDrawing" xmlns:wp="http://schemas.openxmlformats.org/drawingml/2006/wordprocessingDrawing" xmlns:w10="urn:schemas-microsoft-com:office:word" xmlns:w="http://schemas.openxmlformats.org/wordprocessingml/2006/main" xmlns:w14="http://schemas.microsoft.com/office/word/2010/wordml" xmlns:w15="http://schemas.microsoft.com/office/word/2012/wordml" xmlns:w16cex="http://schemas.microsoft.com/office/word/2018/wordml/cex" xmlns:w16cid="http://schemas.microsoft.com/office/word/2016/wordml/cid" xmlns:w16="http://schemas.microsoft.com/office/word/2018/wordml" xmlns:w16du="http://schemas.microsoft.com/office/word/2023/wordml/word16du" xmlns:w16sdtdh="http://schemas.microsoft.com/office/word/2020/wordml/sdtdatahash" xmlns:w16sdtfl="http://schemas.microsoft.com/office/word/2024/wordml/sdtformatlock" xmlns:w16se="http://schemas.microsoft.com/office/word/2015/wordml/symex" xmlns:wpg="http://schemas.microsoft.com/office/word/2010/wordprocessingGroup" xmlns:wpi="http://schemas.microsoft.com/office/word/2010/wordprocessingInk" xmlns:wne="http://schemas.microsoft.com/office/word/2006/wordml" xmlns:wps="http://schemas.microsoft.com/office/word/2010/wordprocessingShape" mc:Ignorable="w14 w15 w16se w16cid w16 w16cex w16sdtdh w16sdtfl w16du wp14">
   <w:abstractNum w:abstractNumId="0" w15:restartNumberingAfterBreak="0">
-    <w:nsid w:val="64BB2A29"/>
+    <w:nsid w:val="31861531"/>
     <w:multiLevelType w:val="hybridMultilevel"/>
-    <w:tmpl w:val="41D2AAEE"/>
-    <w:lvl w:ilvl="0" w:tplc="F8C40B6E">
+    <w:tmpl w:val="346A379E"/>
+    <w:lvl w:ilvl="0" w:tplc="1F046678">
       <w:start w:val="1"/>
       <w:numFmt w:val="bullet"/>
       <w:lvlText w:val="●"/>
@@ -2379,7 +2444,7 @@
         <w:ind w:left="720" w:hanging="360"/>
       </w:pPr>
     </w:lvl>
-    <w:lvl w:ilvl="1" w:tplc="C354E978">
+    <w:lvl w:ilvl="1" w:tplc="8904EE84">
       <w:start w:val="1"/>
       <w:numFmt w:val="bullet"/>
       <w:lvlText w:val="○"/>
@@ -2388,7 +2453,7 @@
         <w:ind w:left="1440" w:hanging="360"/>
       </w:pPr>
     </w:lvl>
-    <w:lvl w:ilvl="2" w:tplc="56603638">
+    <w:lvl w:ilvl="2" w:tplc="DD629112">
       <w:start w:val="1"/>
       <w:numFmt w:val="bullet"/>
       <w:lvlText w:val="■"/>
@@ -2397,7 +2462,7 @@
         <w:ind w:left="2160" w:hanging="360"/>
       </w:pPr>
     </w:lvl>
-    <w:lvl w:ilvl="3" w:tplc="4DDC6242">
+    <w:lvl w:ilvl="3" w:tplc="0B202444">
       <w:start w:val="1"/>
       <w:numFmt w:val="bullet"/>
       <w:lvlText w:val="●"/>
@@ -2406,7 +2471,7 @@
         <w:ind w:left="2880" w:hanging="360"/>
       </w:pPr>
     </w:lvl>
-    <w:lvl w:ilvl="4" w:tplc="104CB9A2">
+    <w:lvl w:ilvl="4" w:tplc="917E1EFE">
       <w:start w:val="1"/>
       <w:numFmt w:val="bullet"/>
       <w:lvlText w:val="○"/>
@@ -2415,7 +2480,7 @@
         <w:ind w:left="3600" w:hanging="360"/>
       </w:pPr>
     </w:lvl>
-    <w:lvl w:ilvl="5" w:tplc="EEA6DE22">
+    <w:lvl w:ilvl="5" w:tplc="7C8EC938">
       <w:start w:val="1"/>
       <w:numFmt w:val="bullet"/>
       <w:lvlText w:val="■"/>
@@ -2424,7 +2489,7 @@
         <w:ind w:left="4320" w:hanging="360"/>
       </w:pPr>
     </w:lvl>
-    <w:lvl w:ilvl="6" w:tplc="38DCCDEC">
+    <w:lvl w:ilvl="6" w:tplc="DC543164">
       <w:start w:val="1"/>
       <w:numFmt w:val="bullet"/>
       <w:lvlText w:val="●"/>
@@ -2433,7 +2498,7 @@
         <w:ind w:left="5040" w:hanging="360"/>
       </w:pPr>
     </w:lvl>
-    <w:lvl w:ilvl="7" w:tplc="676ABC66">
+    <w:lvl w:ilvl="7" w:tplc="23107B28">
       <w:start w:val="1"/>
       <w:numFmt w:val="bullet"/>
       <w:lvlText w:val="●"/>
@@ -2442,7 +2507,7 @@
         <w:ind w:left="5760" w:hanging="360"/>
       </w:pPr>
     </w:lvl>
-    <w:lvl w:ilvl="8" w:tplc="2CA29868">
+    <w:lvl w:ilvl="8" w:tplc="5252A1CC">
       <w:start w:val="1"/>
       <w:numFmt w:val="bullet"/>
       <w:lvlText w:val="●"/>
@@ -2452,7 +2517,7 @@
       </w:pPr>
     </w:lvl>
   </w:abstractNum>
-  <w:num w:numId="1" w16cid:durableId="1847355177">
+  <w:num w:numId="1" w16cid:durableId="1512066883">
     <w:abstractNumId w:val="0"/>
     <w:lvlOverride w:ilvl="0">
       <w:startOverride w:val="1"/>

</xml_diff>